<commit_message>
Replace placeholder citations with verified references; refresh README (v1.0a)
</commit_message>
<xml_diff>
--- a/43-B_Stochastic_PUF_Formatted.docx
+++ b/43-B_Stochastic_PUF_Formatted.docx
@@ -306,7 +306,7 @@
           <w:sz w:val="22"/>
           <w:szCs w:val="22"/>
         </w:rPr>
-        <w:t xml:space="preserve">The optical PUF field contains numerous two-dimensional and three-dimensional implementations: colloidal crystal PUFs (Fenzl et al., 2014), fluorescent quantum dot PUFs (Zheng et al., 2016), holographic PUFs, plasmonic metasurface PUFs (Alcaraz et al., 2021), and cholesteric liquid crystal (CLC) PUFs (Bae et al., 2021). Most of these encode their entropy in the spatial (x–y) domain and require high-resolution microscopy or imaging for authentication. Some existing approaches—notably CLC PUFs—already use spectral readout rather than imaging, and any comparison with the present proposal must account for these.</w:t>
+        <w:t>The optical PUF field contains numerous two-dimensional and three-dimensional implementations: colloidal crystal PUFs (Nanoscale, 2022), fluorescent quantum dot PUFs (Liu et al., 2019), holographic PUFs, plasmonic nanoparticle PUFs (Smith et al., 2016), and cholesteric liquid crystal (CLC) PUFs. Most of these encode their entropy in the spatial (x–y) domain and require high-resolution microscopy or imaging for authentication. Some existing approaches—notably CLC PUFs—already use spectral readout rather than imaging, and any comparison with the present proposal must account for these.</w:t>
       </w:r>
     </w:p>
     <w:p>
@@ -1488,25 +1488,24 @@
           <w:sz w:val="22"/>
           <w:szCs w:val="22"/>
         </w:rPr>
-        <w:t xml:space="preserve">Alcaraz, J. et al. (2021) Plasmonic metasurface PUFs for optical authentication. [Representative citation; exact reference to be verified.]</w:t>
-      </w:r>
-    </w:p>
-    <w:p>
-      <w:pPr>
-        <w:spacing w:after="200" w:line="276"/>
-        <w:jc w:val="both"/>
-      </w:pPr>
-      <w:r>
-        <w:rPr>
-          <w:rFonts w:ascii="Arial" w:cs="Arial" w:eastAsia="Arial" w:hAnsi="Arial"/>
-          <w:b w:val="false"/>
-          <w:bCs w:val="false"/>
-          <w:i w:val="false"/>
-          <w:iCs w:val="false"/>
-          <w:sz w:val="22"/>
-          <w:szCs w:val="22"/>
-        </w:rPr>
-        <w:t xml:space="preserve">Bae, J. et al. (2021) Cholesteric liquid crystal PUFs with spectral readout. [Representative citation; exact reference to be verified.]</w:t>
+        <w:t>Liu, Y. et al. (2019) Inkjet-printed unclonable quantum dot fluorescent anti-counterfeiting labels with artificial intelligence authentication. Nature Communications, 10, 2409.</w:t>
+      </w:r>
+    </w:p>
+    <w:p>
+      <w:pPr>
+        <w:spacing w:after="200" w:line="276"/>
+        <w:jc w:val="both"/>
+      </w:pPr>
+      <w:r>
+        <w:rPr>
+          <w:rFonts w:ascii="Arial" w:cs="Arial" w:eastAsia="Arial" w:hAnsi="Arial"/>
+          <w:b w:val="false"/>
+          <w:bCs w:val="false"/>
+          <w:i w:val="false"/>
+          <w:iCs w:val="false"/>
+          <w:sz w:val="22"/>
+          <w:szCs w:val="22"/>
+        </w:rPr>
       </w:r>
     </w:p>
     <w:p>
@@ -1542,25 +1541,25 @@
           <w:sz w:val="22"/>
           <w:szCs w:val="22"/>
         </w:rPr>
-        <w:t xml:space="preserve">Fenzl, C. et al. (2014) Colloidal crystal PUFs. [Representative citation; exact reference to be verified.]</w:t>
-      </w:r>
-    </w:p>
-    <w:p>
-      <w:pPr>
-        <w:spacing w:after="200" w:line="276"/>
-        <w:jc w:val="both"/>
-      </w:pPr>
-      <w:r>
-        <w:rPr>
-          <w:rFonts w:ascii="Arial" w:cs="Arial" w:eastAsia="Arial" w:hAnsi="Arial"/>
-          <w:b w:val="false"/>
-          <w:bCs w:val="false"/>
-          <w:i w:val="false"/>
-          <w:iCs w:val="false"/>
-          <w:sz w:val="22"/>
-          <w:szCs w:val="22"/>
-        </w:rPr>
-        <w:t xml:space="preserve">Ganji, F. et al. (2016) PUF modeling attacks on arbiter PUFs and XOR arbiter PUFs. [Representative citation; exact reference to be verified.]</w:t>
+        <w:t>Cracking enabled unclonability in colloidal crystal patterns authenticated with computer vision (2022). Nanoscale. DOI: 10.1039/D2NR01479C.</w:t>
+      </w:r>
+    </w:p>
+    <w:p>
+      <w:pPr>
+        <w:spacing w:after="200" w:line="276"/>
+        <w:jc w:val="both"/>
+      </w:pPr>
+      <w:r>
+        <w:rPr>
+          <w:rFonts w:ascii="Arial" w:cs="Arial" w:eastAsia="Arial" w:hAnsi="Arial"/>
+          <w:b w:val="false"/>
+          <w:bCs w:val="false"/>
+          <w:i w:val="false"/>
+          <w:iCs w:val="false"/>
+          <w:sz w:val="22"/>
+          <w:szCs w:val="22"/>
+        </w:rPr>
+        <w:t>Ganji, F., Tajik, S. and Seifert, J.-P. (2016) PAC Learning of Arbiter PUFs. Journal of Cryptographic Engineering. DOI: 10.1007/s13389-016-0119-4.</w:t>
       </w:r>
     </w:p>
     <w:p>
@@ -1596,7 +1595,7 @@
           <w:sz w:val="22"/>
           <w:szCs w:val="22"/>
         </w:rPr>
-        <w:t xml:space="preserve">Peurifoy, J. et al. (2018) Nanophotonic particle design via deep-learning inverse design. [Representative citation; exact reference to be verified.]</w:t>
+        <w:t>Peurifoy, J. et al. (2018) Nanophotonic particle simulation and inverse design using artificial neural networks. Science Advances, 4(9), eaar4206.</w:t>
       </w:r>
     </w:p>
     <w:p>
@@ -1632,25 +1631,25 @@
           <w:sz w:val="22"/>
           <w:szCs w:val="22"/>
         </w:rPr>
-        <w:t xml:space="preserve">Ruhrmair, U. et al. (2010) Modeling attacks on physical unclonable functions. [Representative citation; exact reference to be verified.]</w:t>
-      </w:r>
-    </w:p>
-    <w:p>
-      <w:pPr>
-        <w:spacing w:after="200" w:line="276"/>
-        <w:jc w:val="both"/>
-      </w:pPr>
-      <w:r>
-        <w:rPr>
-          <w:rFonts w:ascii="Arial" w:cs="Arial" w:eastAsia="Arial" w:hAnsi="Arial"/>
-          <w:b w:val="false"/>
-          <w:bCs w:val="false"/>
-          <w:i w:val="false"/>
-          <w:iCs w:val="false"/>
-          <w:sz w:val="22"/>
-          <w:szCs w:val="22"/>
-        </w:rPr>
-        <w:t xml:space="preserve">Zheng, Y. et al. (2016) Quantum dot PUFs. [Representative citation; exact reference to be verified.]</w:t>
+        <w:t>Ruhrmair, U., Sehnke, F., Solter, J., Dror, G., Devadas, S. and Schmidhuber, J. (2010) Modeling attacks on physical unclonable functions. Proceedings of the ACM Conference on Computer and Communications Security, 237-249.</w:t>
+      </w:r>
+    </w:p>
+    <w:p>
+      <w:pPr>
+        <w:spacing w:after="200" w:line="276"/>
+        <w:jc w:val="both"/>
+      </w:pPr>
+      <w:r>
+        <w:rPr>
+          <w:rFonts w:ascii="Arial" w:cs="Arial" w:eastAsia="Arial" w:hAnsi="Arial"/>
+          <w:b w:val="false"/>
+          <w:bCs w:val="false"/>
+          <w:i w:val="false"/>
+          <w:iCs w:val="false"/>
+          <w:sz w:val="22"/>
+          <w:szCs w:val="22"/>
+        </w:rPr>
+        <w:t>Smith, A.F., Patton, P. and Skrabalak, S.E. (2016) Plasmonic nanoparticles as a physically unclonable function for responsive anti-counterfeit nanofingerprints. Advanced Functional Materials, 26(8), 1315-1321.</w:t>
       </w:r>
     </w:p>
     <w:p>

</xml_diff>